<commit_message>
feat(data processing): update new table bridge_director and bridge_actor to database
</commit_message>
<xml_diff>
--- a/docs/report.docx
+++ b/docs/report.docx
@@ -3445,11 +3445,11 @@
       </w:r>
       <w:proofErr w:type="spellEnd"/>
       <w:r>
-        <w:t xml:space="preserve"> viên th</w:t>
-      </w:r>
-      <w:proofErr w:type="spellStart"/>
-      <w:r>
-        <w:t>ực</w:t>
+        <w:t xml:space="preserve"> viên </w:t>
+      </w:r>
+      <w:proofErr w:type="spellStart"/>
+      <w:r>
+        <w:t>thực</w:t>
       </w:r>
       <w:proofErr w:type="spellEnd"/>
       <w:r>
@@ -4564,117 +4564,101 @@
       <w:pPr>
         <w:pStyle w:val="Heading3"/>
       </w:pPr>
-      <w:proofErr w:type="spellStart"/>
-      <w:r>
+      <w:r>
+        <w:t>Tổng quan dữ liệu</w:t>
+      </w:r>
+    </w:p>
+    <w:p>
+      <w:pPr>
+        <w:pStyle w:val="Nidung"/>
+        <w:rPr>
+          <w:lang w:val="vi-VN"/>
+        </w:rPr>
+      </w:pPr>
+      <w:r>
+        <w:rPr>
+          <w:lang w:val="vi-VN"/>
+        </w:rPr>
+        <w:t xml:space="preserve">Bộ </w:t>
+      </w:r>
+      <w:r>
+        <w:rPr>
+          <w:lang w:val="vi-VN"/>
+        </w:rPr>
+        <w:t>dữ liệu chính được sử dụng trong đề tài này</w:t>
+      </w:r>
+      <w:r>
+        <w:rPr>
+          <w:lang w:val="vi-VN"/>
+        </w:rPr>
+        <w:t xml:space="preserve"> tên là </w:t>
+      </w:r>
+      <w:r>
+        <w:t>Netflix Movies and TV Shows</w:t>
+      </w:r>
+      <w:r>
+        <w:rPr>
+          <w:lang w:val="vi-VN"/>
+        </w:rPr>
+        <w:t xml:space="preserve"> </w:t>
+      </w:r>
+      <w:r>
+        <w:rPr>
+          <w:lang w:val="vi-VN"/>
+        </w:rPr>
+        <w:t>“</w:t>
+      </w:r>
+      <w:proofErr w:type="spellStart"/>
+      <w:r>
+        <w:rPr>
+          <w:lang w:val="vi-VN"/>
+        </w:rPr>
         <w:t>Netflix</w:t>
       </w:r>
       <w:proofErr w:type="spellEnd"/>
       <w:r>
-        <w:t xml:space="preserve"> </w:t>
-      </w:r>
-      <w:proofErr w:type="spellStart"/>
-      <w:r>
+        <w:rPr>
+          <w:lang w:val="vi-VN"/>
+        </w:rPr>
+        <w:t xml:space="preserve"> </w:t>
+      </w:r>
+      <w:proofErr w:type="spellStart"/>
+      <w:r>
+        <w:rPr>
+          <w:lang w:val="vi-VN"/>
+        </w:rPr>
         <w:t>Movies</w:t>
       </w:r>
       <w:proofErr w:type="spellEnd"/>
       <w:r>
-        <w:t xml:space="preserve"> </w:t>
-      </w:r>
-      <w:proofErr w:type="spellStart"/>
-      <w:r>
+        <w:rPr>
+          <w:lang w:val="vi-VN"/>
+        </w:rPr>
+        <w:t xml:space="preserve"> </w:t>
+      </w:r>
+      <w:proofErr w:type="spellStart"/>
+      <w:r>
+        <w:rPr>
+          <w:lang w:val="vi-VN"/>
+        </w:rPr>
         <w:t>and</w:t>
       </w:r>
       <w:proofErr w:type="spellEnd"/>
       <w:r>
+        <w:rPr>
+          <w:lang w:val="vi-VN"/>
+        </w:rPr>
         <w:t xml:space="preserve"> TV </w:t>
       </w:r>
       <w:proofErr w:type="spellStart"/>
       <w:r>
+        <w:rPr>
+          <w:lang w:val="vi-VN"/>
+        </w:rPr>
         <w:t>Shows</w:t>
       </w:r>
       <w:proofErr w:type="spellEnd"/>
       <w:r>
-        <w:t xml:space="preserve"> (</w:t>
-      </w:r>
-      <w:r>
-        <w:rPr>
-          <w:lang w:val="en-US"/>
-        </w:rPr>
-        <w:t>Shivam Bansal</w:t>
-      </w:r>
-      <w:r>
-        <w:t>)</w:t>
-      </w:r>
-    </w:p>
-    <w:p>
-      <w:pPr>
-        <w:pStyle w:val="Nidung"/>
-        <w:rPr>
-          <w:lang w:val="vi-VN"/>
-        </w:rPr>
-      </w:pPr>
-      <w:proofErr w:type="spellStart"/>
-      <w:r>
-        <w:t>Đây</w:t>
-      </w:r>
-      <w:proofErr w:type="spellEnd"/>
-      <w:r>
-        <w:rPr>
-          <w:lang w:val="vi-VN"/>
-        </w:rPr>
-        <w:t xml:space="preserve"> là bộ dữ liệu chính được sử dụng trong đề tài này, có tên chính thức là “</w:t>
-      </w:r>
-      <w:proofErr w:type="spellStart"/>
-      <w:r>
-        <w:rPr>
-          <w:lang w:val="vi-VN"/>
-        </w:rPr>
-        <w:t>Netflix</w:t>
-      </w:r>
-      <w:proofErr w:type="spellEnd"/>
-      <w:r>
-        <w:rPr>
-          <w:lang w:val="vi-VN"/>
-        </w:rPr>
-        <w:t xml:space="preserve"> </w:t>
-      </w:r>
-      <w:proofErr w:type="spellStart"/>
-      <w:r>
-        <w:rPr>
-          <w:lang w:val="vi-VN"/>
-        </w:rPr>
-        <w:t>Movies</w:t>
-      </w:r>
-      <w:proofErr w:type="spellEnd"/>
-      <w:r>
-        <w:rPr>
-          <w:lang w:val="vi-VN"/>
-        </w:rPr>
-        <w:t xml:space="preserve"> </w:t>
-      </w:r>
-      <w:proofErr w:type="spellStart"/>
-      <w:r>
-        <w:rPr>
-          <w:lang w:val="vi-VN"/>
-        </w:rPr>
-        <w:t>and</w:t>
-      </w:r>
-      <w:proofErr w:type="spellEnd"/>
-      <w:r>
-        <w:rPr>
-          <w:lang w:val="vi-VN"/>
-        </w:rPr>
-        <w:t xml:space="preserve"> TV </w:t>
-      </w:r>
-      <w:proofErr w:type="spellStart"/>
-      <w:r>
-        <w:rPr>
-          <w:lang w:val="vi-VN"/>
-        </w:rPr>
-        <w:t>Shows</w:t>
-      </w:r>
-      <w:proofErr w:type="spellEnd"/>
-      <w:r>
         <w:rPr>
           <w:lang w:val="vi-VN"/>
         </w:rPr>
@@ -4706,27 +4690,19 @@
         <w:rPr>
           <w:lang w:val="vi-VN"/>
         </w:rPr>
-        <w:t xml:space="preserve"> đăng tải đầu tiên trên nền tảng. Nó đã được thu thập và cập nhật thường xuyên đến năm 2021 thông qua các API </w:t>
-      </w:r>
-      <w:proofErr w:type="spellStart"/>
-      <w:r>
-        <w:rPr>
-          <w:lang w:val="vi-VN"/>
-        </w:rPr>
-        <w:t>Calls</w:t>
-      </w:r>
-      <w:proofErr w:type="spellEnd"/>
-      <w:r>
-        <w:rPr>
-          <w:lang w:val="vi-VN"/>
-        </w:rPr>
-        <w:t xml:space="preserve">. </w:t>
-      </w:r>
-      <w:r>
-        <w:rPr>
-          <w:lang w:val="vi-VN"/>
-        </w:rPr>
-        <w:t xml:space="preserve">Bộ dữ liệu này cũng được đánh giá rất cao bởi nền tảng </w:t>
+        <w:t xml:space="preserve"> đăng tải đầu tiên trên nền tảng. </w:t>
+      </w:r>
+      <w:r>
+        <w:rPr>
+          <w:lang w:val="vi-VN"/>
+        </w:rPr>
+        <w:t xml:space="preserve">Nhận </w:t>
+      </w:r>
+      <w:r>
+        <w:rPr>
+          <w:lang w:val="vi-VN"/>
+        </w:rPr>
+        <w:t xml:space="preserve">được đánh giá rất cao bởi nền tảng </w:t>
       </w:r>
       <w:proofErr w:type="spellStart"/>
       <w:r>
@@ -4753,6 +4729,7 @@
       </w:pPr>
       <w:r>
         <w:rPr>
+          <w:noProof/>
           <w:lang w:val="vi-VN"/>
         </w:rPr>
         <w:drawing>
@@ -4857,6 +4834,7 @@
       </w:pPr>
       <w:r>
         <w:rPr>
+          <w:noProof/>
           <w:lang w:val="vi-VN"/>
         </w:rPr>
         <w:drawing>
@@ -4901,14 +4879,232 @@
         <w:pStyle w:val="Heading3"/>
       </w:pPr>
       <w:r>
+        <w:t>Mô tả</w:t>
+      </w:r>
+      <w:r>
+        <w:t xml:space="preserve"> </w:t>
+      </w:r>
+      <w:r>
+        <w:t>dữ liệu</w:t>
+      </w:r>
+    </w:p>
+    <w:p>
+      <w:pPr>
+        <w:pStyle w:val="Nidung"/>
+        <w:rPr>
+          <w:lang w:val="vi-VN"/>
+        </w:rPr>
+      </w:pPr>
+      <w:r>
+        <w:rPr>
+          <w:lang w:val="vi-VN"/>
+        </w:rPr>
+        <w:t xml:space="preserve">Sử dụng hoàn toàn bằng ngôn ngữ tiếng Anh, lưu hành dưới dạng tệp tin CSV gồm 8807 bản ghi </w:t>
+      </w:r>
+      <w:r>
+        <w:rPr>
+          <w:lang w:val="vi-VN"/>
+        </w:rPr>
+        <w:t xml:space="preserve">với 12 trường dữ liệu </w:t>
+      </w:r>
+      <w:r>
+        <w:rPr>
+          <w:lang w:val="vi-VN"/>
+        </w:rPr>
+        <w:t>và nặng sắp xỉ 3.</w:t>
+      </w:r>
+      <w:r>
+        <w:rPr>
+          <w:lang w:val="vi-VN"/>
+        </w:rPr>
+        <w:t>4MB.</w:t>
+      </w:r>
+      <w:r>
+        <w:rPr>
+          <w:lang w:val="vi-VN"/>
+        </w:rPr>
+        <w:t xml:space="preserve"> </w:t>
+      </w:r>
+      <w:r>
+        <w:rPr>
+          <w:lang w:val="vi-VN"/>
+        </w:rPr>
+        <w:t xml:space="preserve">Các </w:t>
+      </w:r>
+      <w:r>
+        <w:rPr>
+          <w:lang w:val="vi-VN"/>
+        </w:rPr>
+        <w:t xml:space="preserve">trường dữ liệu </w:t>
+      </w:r>
+      <w:r>
+        <w:rPr>
+          <w:lang w:val="vi-VN"/>
+        </w:rPr>
+        <w:t xml:space="preserve">cụ thể </w:t>
+      </w:r>
+      <w:r>
+        <w:rPr>
+          <w:lang w:val="vi-VN"/>
+        </w:rPr>
+        <w:t xml:space="preserve">chứa </w:t>
+      </w:r>
+      <w:r>
+        <w:rPr>
+          <w:lang w:val="vi-VN"/>
+        </w:rPr>
         <w:lastRenderedPageBreak/>
-        <w:t>Mô tả</w:t>
-      </w:r>
-      <w:r>
-        <w:t xml:space="preserve"> </w:t>
-      </w:r>
-      <w:r>
-        <w:t>dữ liệu</w:t>
+        <w:t>thông tin về mã định danh chương trình (</w:t>
+      </w:r>
+      <w:proofErr w:type="spellStart"/>
+      <w:r>
+        <w:rPr>
+          <w:lang w:val="vi-VN"/>
+        </w:rPr>
+        <w:t>show_id</w:t>
+      </w:r>
+      <w:proofErr w:type="spellEnd"/>
+      <w:r>
+        <w:rPr>
+          <w:lang w:val="vi-VN"/>
+        </w:rPr>
+        <w:t>)</w:t>
+      </w:r>
+      <w:r>
+        <w:rPr>
+          <w:lang w:val="vi-VN"/>
+        </w:rPr>
+        <w:t xml:space="preserve">, </w:t>
+      </w:r>
+      <w:r>
+        <w:rPr>
+          <w:lang w:val="vi-VN"/>
+        </w:rPr>
+        <w:t>loại chương trình (</w:t>
+      </w:r>
+      <w:proofErr w:type="spellStart"/>
+      <w:r>
+        <w:rPr>
+          <w:lang w:val="vi-VN"/>
+        </w:rPr>
+        <w:t>type</w:t>
+      </w:r>
+      <w:proofErr w:type="spellEnd"/>
+      <w:r>
+        <w:rPr>
+          <w:lang w:val="vi-VN"/>
+        </w:rPr>
+        <w:t>), tên chương trình (</w:t>
+      </w:r>
+      <w:proofErr w:type="spellStart"/>
+      <w:r>
+        <w:rPr>
+          <w:lang w:val="vi-VN"/>
+        </w:rPr>
+        <w:t>title</w:t>
+      </w:r>
+      <w:proofErr w:type="spellEnd"/>
+      <w:r>
+        <w:rPr>
+          <w:lang w:val="vi-VN"/>
+        </w:rPr>
+        <w:t>), tên đạo diễn (</w:t>
+      </w:r>
+      <w:proofErr w:type="spellStart"/>
+      <w:r>
+        <w:rPr>
+          <w:lang w:val="vi-VN"/>
+        </w:rPr>
+        <w:t>director</w:t>
+      </w:r>
+      <w:proofErr w:type="spellEnd"/>
+      <w:r>
+        <w:rPr>
+          <w:lang w:val="vi-VN"/>
+        </w:rPr>
+        <w:t>), tên diễn viên (</w:t>
+      </w:r>
+      <w:proofErr w:type="spellStart"/>
+      <w:r>
+        <w:rPr>
+          <w:lang w:val="vi-VN"/>
+        </w:rPr>
+        <w:t>cast</w:t>
+      </w:r>
+      <w:proofErr w:type="spellEnd"/>
+      <w:r>
+        <w:rPr>
+          <w:lang w:val="vi-VN"/>
+        </w:rPr>
+        <w:t>), nước sản xuất (</w:t>
+      </w:r>
+      <w:proofErr w:type="spellStart"/>
+      <w:r>
+        <w:rPr>
+          <w:lang w:val="vi-VN"/>
+        </w:rPr>
+        <w:t>country</w:t>
+      </w:r>
+      <w:proofErr w:type="spellEnd"/>
+      <w:r>
+        <w:rPr>
+          <w:lang w:val="vi-VN"/>
+        </w:rPr>
+        <w:t>), ngày thêm vào (</w:t>
+      </w:r>
+      <w:proofErr w:type="spellStart"/>
+      <w:r>
+        <w:rPr>
+          <w:lang w:val="vi-VN"/>
+        </w:rPr>
+        <w:t>date_added</w:t>
+      </w:r>
+      <w:proofErr w:type="spellEnd"/>
+      <w:r>
+        <w:rPr>
+          <w:lang w:val="vi-VN"/>
+        </w:rPr>
+        <w:t>), nhãn đánh giá (</w:t>
+      </w:r>
+      <w:proofErr w:type="spellStart"/>
+      <w:r>
+        <w:rPr>
+          <w:lang w:val="vi-VN"/>
+        </w:rPr>
+        <w:t>rating</w:t>
+      </w:r>
+      <w:proofErr w:type="spellEnd"/>
+      <w:r>
+        <w:rPr>
+          <w:lang w:val="vi-VN"/>
+        </w:rPr>
+        <w:t>)</w:t>
+      </w:r>
+      <w:r>
+        <w:rPr>
+          <w:lang w:val="vi-VN"/>
+        </w:rPr>
+        <w:t>, độ dài chương trình (</w:t>
+      </w:r>
+      <w:proofErr w:type="spellStart"/>
+      <w:r>
+        <w:rPr>
+          <w:lang w:val="vi-VN"/>
+        </w:rPr>
+        <w:t>duration</w:t>
+      </w:r>
+      <w:proofErr w:type="spellEnd"/>
+      <w:r>
+        <w:rPr>
+          <w:lang w:val="vi-VN"/>
+        </w:rPr>
+        <w:t>)</w:t>
+      </w:r>
+      <w:r>
+        <w:rPr>
+          <w:lang w:val="vi-VN"/>
+        </w:rPr>
+        <w:t>.</w:t>
       </w:r>
     </w:p>
     <w:p>
@@ -4922,164 +5118,97 @@
         <w:rPr>
           <w:lang w:val="vi-VN"/>
         </w:rPr>
-        <w:t>Bộ dữ liệu gồm các</w:t>
-      </w:r>
-      <w:r>
-        <w:rPr>
-          <w:lang w:val="vi-VN"/>
-        </w:rPr>
-        <w:t xml:space="preserve"> trường dữ liệu chứa thông tin về mã định danh chương trình (</w:t>
-      </w:r>
-      <w:proofErr w:type="spellStart"/>
-      <w:r>
-        <w:rPr>
-          <w:lang w:val="vi-VN"/>
-        </w:rPr>
-        <w:t>show_id</w:t>
-      </w:r>
-      <w:proofErr w:type="spellEnd"/>
-      <w:r>
-        <w:rPr>
-          <w:lang w:val="vi-VN"/>
-        </w:rPr>
-        <w:t>)</w:t>
-      </w:r>
-      <w:r>
-        <w:rPr>
-          <w:lang w:val="vi-VN"/>
-        </w:rPr>
+        <w:t>Bộ dữ liệu gồm</w:t>
+      </w:r>
+      <w:r>
+        <w:rPr>
+          <w:lang w:val="vi-VN"/>
+        </w:rPr>
+        <w:t xml:space="preserve"> các tựa phim từ được ra mắt từ năm 1925 – 2021</w:t>
+      </w:r>
+      <w:r>
         <w:t xml:space="preserve">, </w:t>
       </w:r>
       <w:r>
         <w:rPr>
           <w:lang w:val="vi-VN"/>
         </w:rPr>
-        <w:t>loại chương trình (</w:t>
-      </w:r>
-      <w:proofErr w:type="spellStart"/>
-      <w:r>
-        <w:rPr>
-          <w:lang w:val="vi-VN"/>
-        </w:rPr>
-        <w:t>type</w:t>
-      </w:r>
-      <w:proofErr w:type="spellEnd"/>
-      <w:r>
-        <w:rPr>
-          <w:lang w:val="vi-VN"/>
-        </w:rPr>
-        <w:t>), tên chương trình (</w:t>
-      </w:r>
-      <w:proofErr w:type="spellStart"/>
-      <w:r>
-        <w:rPr>
-          <w:lang w:val="vi-VN"/>
-        </w:rPr>
-        <w:t>title</w:t>
-      </w:r>
-      <w:proofErr w:type="spellEnd"/>
-      <w:r>
-        <w:rPr>
-          <w:lang w:val="vi-VN"/>
-        </w:rPr>
-        <w:t>), tên đạo diễn (</w:t>
-      </w:r>
-      <w:proofErr w:type="spellStart"/>
-      <w:r>
-        <w:rPr>
-          <w:lang w:val="vi-VN"/>
-        </w:rPr>
-        <w:t>director</w:t>
-      </w:r>
-      <w:proofErr w:type="spellEnd"/>
-      <w:r>
-        <w:rPr>
-          <w:lang w:val="vi-VN"/>
-        </w:rPr>
-        <w:t>), tên diễn viên (</w:t>
-      </w:r>
-      <w:proofErr w:type="spellStart"/>
-      <w:r>
-        <w:rPr>
-          <w:lang w:val="vi-VN"/>
-        </w:rPr>
-        <w:t>cast</w:t>
-      </w:r>
-      <w:proofErr w:type="spellEnd"/>
-      <w:r>
-        <w:rPr>
-          <w:lang w:val="vi-VN"/>
-        </w:rPr>
-        <w:t>), nước sản xuất (</w:t>
-      </w:r>
-      <w:proofErr w:type="spellStart"/>
-      <w:r>
-        <w:rPr>
-          <w:lang w:val="vi-VN"/>
-        </w:rPr>
-        <w:t>country</w:t>
-      </w:r>
-      <w:proofErr w:type="spellEnd"/>
-      <w:r>
-        <w:rPr>
-          <w:lang w:val="vi-VN"/>
-        </w:rPr>
-        <w:t>), ngày thêm vào (</w:t>
-      </w:r>
-      <w:proofErr w:type="spellStart"/>
-      <w:r>
-        <w:rPr>
-          <w:lang w:val="vi-VN"/>
-        </w:rPr>
-        <w:t>date_added</w:t>
-      </w:r>
-      <w:proofErr w:type="spellEnd"/>
-      <w:r>
-        <w:rPr>
-          <w:lang w:val="vi-VN"/>
-        </w:rPr>
-        <w:t>), nhãn đánh giá (</w:t>
-      </w:r>
-      <w:proofErr w:type="spellStart"/>
-      <w:r>
-        <w:rPr>
-          <w:lang w:val="vi-VN"/>
-        </w:rPr>
-        <w:t>rating</w:t>
-      </w:r>
-      <w:proofErr w:type="spellEnd"/>
-      <w:r>
-        <w:rPr>
-          <w:lang w:val="vi-VN"/>
-        </w:rPr>
-        <w:t>)</w:t>
-      </w:r>
-      <w:r>
-        <w:rPr>
-          <w:lang w:val="vi-VN"/>
-        </w:rPr>
-        <w:t>, độ dài chương trình (</w:t>
-      </w:r>
-      <w:proofErr w:type="spellStart"/>
-      <w:r>
-        <w:rPr>
-          <w:lang w:val="vi-VN"/>
-        </w:rPr>
-        <w:t>duration</w:t>
-      </w:r>
-      <w:proofErr w:type="spellEnd"/>
-      <w:r>
-        <w:rPr>
-          <w:lang w:val="vi-VN"/>
-        </w:rPr>
-        <w:t>)</w:t>
-      </w:r>
+        <w:t xml:space="preserve">được </w:t>
+      </w:r>
+      <w:proofErr w:type="spellStart"/>
+      <w:r>
+        <w:rPr>
+          <w:lang w:val="vi-VN"/>
+        </w:rPr>
+        <w:t>Netflix</w:t>
+      </w:r>
+      <w:proofErr w:type="spellEnd"/>
+      <w:r>
+        <w:rPr>
+          <w:lang w:val="vi-VN"/>
+        </w:rPr>
+        <w:t xml:space="preserve"> cập nhật vào kho phim của mình trong giai đoạn 2008 – 2021 </w:t>
+      </w:r>
+      <w:r>
+        <w:rPr>
+          <w:lang w:val="vi-VN"/>
+        </w:rPr>
+        <w:t>thông qua các bản hợp đồng.</w:t>
+      </w:r>
+      <w:r>
+        <w:rPr>
+          <w:lang w:val="vi-VN"/>
+        </w:rPr>
+        <w:t xml:space="preserve"> </w:t>
+      </w:r>
+      <w:r>
+        <w:rPr>
+          <w:lang w:val="vi-VN"/>
+        </w:rPr>
+        <w:t xml:space="preserve">Nó đã được thu thập và cập nhật thường xuyên cho đến năm 2021 thông qua các API </w:t>
+      </w:r>
+      <w:proofErr w:type="spellStart"/>
+      <w:r>
+        <w:rPr>
+          <w:lang w:val="vi-VN"/>
+        </w:rPr>
+        <w:t>Calls</w:t>
+      </w:r>
+      <w:proofErr w:type="spellEnd"/>
+      <w:r>
+        <w:rPr>
+          <w:lang w:val="vi-VN"/>
+        </w:rPr>
+        <w:t xml:space="preserve"> lên chính trang chủ của </w:t>
+      </w:r>
+      <w:proofErr w:type="spellStart"/>
+      <w:r>
+        <w:rPr>
+          <w:lang w:val="vi-VN"/>
+        </w:rPr>
+        <w:t>Netflix</w:t>
+      </w:r>
+      <w:proofErr w:type="spellEnd"/>
       <w:r>
         <w:rPr>
           <w:lang w:val="vi-VN"/>
         </w:rPr>
         <w:t>.</w:t>
       </w:r>
+      <w:r>
+        <w:rPr>
+          <w:lang w:val="vi-VN"/>
+        </w:rPr>
+        <w:t xml:space="preserve"> Vì vậy nên tính chính xác rất cao.</w:t>
+      </w:r>
+    </w:p>
+    <w:p>
+      <w:pPr>
+        <w:pStyle w:val="Heading3"/>
+      </w:pPr>
+      <w:r>
+        <w:t>Sử dụng dữ liệu</w:t>
+      </w:r>
     </w:p>
     <w:p>
       <w:pPr>
@@ -5088,52 +5217,102 @@
           <w:lang w:val="vi-VN"/>
         </w:rPr>
       </w:pPr>
+      <w:r>
+        <w:rPr>
+          <w:lang w:val="vi-VN"/>
+        </w:rPr>
+        <w:t>Đây là bộ dữ liệu chính được sử dụng trong đề tài</w:t>
+      </w:r>
+      <w:r>
+        <w:rPr>
+          <w:lang w:val="vi-VN"/>
+        </w:rPr>
+        <w:t xml:space="preserve"> của nhóm, </w:t>
+      </w:r>
+    </w:p>
+    <w:p>
+      <w:pPr>
+        <w:pStyle w:val="Heading2"/>
+      </w:pPr>
+      <w:r>
+        <w:t>TIỀN XỬ LÝ DỮ LIỆU</w:t>
+      </w:r>
     </w:p>
     <w:p>
       <w:pPr>
         <w:pStyle w:val="Heading3"/>
       </w:pPr>
-      <w:proofErr w:type="spellStart"/>
-      <w:r>
-        <w:t>Sử</w:t>
-      </w:r>
-      <w:proofErr w:type="spellEnd"/>
-      <w:r>
-        <w:t xml:space="preserve"> dụng dữ liệu</w:t>
+      <w:r>
+        <w:t>Đ</w:t>
+      </w:r>
+      <w:r>
+        <w:t>ọc dữ liệu</w:t>
       </w:r>
     </w:p>
     <w:p>
       <w:pPr>
         <w:pStyle w:val="Nidung"/>
-        <w:rPr>
-          <w:lang w:val="vi-VN"/>
-        </w:rPr>
-      </w:pPr>
-      <w:r>
-        <w:rPr>
-          <w:lang w:val="vi-VN"/>
-        </w:rPr>
-        <w:t>Đây là bộ dữ liệu chính được sử dụng trong đề tài</w:t>
-      </w:r>
-      <w:r>
-        <w:rPr>
-          <w:lang w:val="vi-VN"/>
-        </w:rPr>
-        <w:t xml:space="preserve"> của nhóm, </w:t>
-      </w:r>
-    </w:p>
-    <w:p>
-      <w:pPr>
-        <w:pStyle w:val="Heading2"/>
-      </w:pPr>
-      <w:r>
-        <w:t>TIỀN XỬ LÝ DỮ LIỆU</w:t>
-      </w:r>
-    </w:p>
-    <w:p>
-      <w:pPr>
-        <w:pStyle w:val="Heading3"/>
-      </w:pPr>
+      </w:pPr>
+      <w:r>
+        <w:rPr>
+          <w:lang w:val="vi-VN"/>
+        </w:rPr>
+        <w:t xml:space="preserve">Nhóm sử dụng </w:t>
+      </w:r>
+      <w:proofErr w:type="spellStart"/>
+      <w:r>
+        <w:rPr>
+          <w:lang w:val="vi-VN"/>
+        </w:rPr>
+        <w:t>Python</w:t>
+      </w:r>
+      <w:proofErr w:type="spellEnd"/>
+      <w:r>
+        <w:rPr>
+          <w:lang w:val="vi-VN"/>
+        </w:rPr>
+        <w:t xml:space="preserve"> và thư viện </w:t>
+      </w:r>
+      <w:proofErr w:type="spellStart"/>
+      <w:r>
+        <w:rPr>
+          <w:lang w:val="vi-VN"/>
+        </w:rPr>
+        <w:t>Pandas</w:t>
+      </w:r>
+      <w:proofErr w:type="spellEnd"/>
+      <w:r>
+        <w:rPr>
+          <w:lang w:val="vi-VN"/>
+        </w:rPr>
+        <w:t xml:space="preserve"> để đọc dữ liệu này thông qua hàm </w:t>
+      </w:r>
+      <w:proofErr w:type="spellStart"/>
+      <w:r>
+        <w:rPr>
+          <w:lang w:val="vi-VN"/>
+        </w:rPr>
+        <w:t>pd.read_</w:t>
+      </w:r>
+      <w:r>
+        <w:rPr>
+          <w:lang w:val="vi-VN"/>
+        </w:rPr>
+        <w:t>csv</w:t>
+      </w:r>
+      <w:proofErr w:type="spellEnd"/>
+      <w:r>
+        <w:rPr>
+          <w:lang w:val="vi-VN"/>
+        </w:rPr>
+        <w:t>()</w:t>
+      </w:r>
+      <w:r>
+        <w:rPr>
+          <w:lang w:val="vi-VN"/>
+        </w:rPr>
+        <w:t xml:space="preserve"> và </w:t>
+      </w:r>
     </w:p>
     <w:p>
       <w:pPr>
@@ -7808,6 +7987,7 @@
   <w:style w:type="character" w:default="1" w:styleId="DefaultParagraphFont">
     <w:name w:val="Default Paragraph Font"/>
     <w:uiPriority w:val="1"/>
+    <w:semiHidden/>
     <w:unhideWhenUsed/>
   </w:style>
   <w:style w:type="table" w:default="1" w:styleId="TableNormal">

</xml_diff>